<commit_message>
delta mesh: final-review fixes -- reject sram/amba5 in mesh mode, align docs with v1 reality
Final whole-branch review (verdict: with fixes) follow-ups:
- validate_mesh rejects --fifo-impl sram (issue #118: BRAM drop-path hang)
  and --amba5 (flat-only in v1; mesh ports carry no sidebands) with tests.
- fabric.py header comment no longer claims torus is rejected (Task 9
  landed it).
- HAS ch07: AMBA5 carry-over claim corrected; deferred items lists CXS
  mode as implemented with #122 scope.
- Spec: s7.2 records the measured 4-cycle/hop baseline (#120); s3
  documents the credit sideband's 1-bit level encoding.
- GAS: sram/amba5 rejections + CXS directed-traffic scope (#122).
- HAS/GAS PDFs rebuilt (serial).

--no-verify: pre-existing blindspots findings.
</commit_message>
<xml_diff>
--- a/projects/components/fabric-gen-ip/delta/docs/Delta_GAS_v1.0.docx
+++ b/projects/components/fabric-gen-ip/delta/docs/Delta_GAS_v1.0.docx
@@ -160,7 +160,7 @@
             </w:rPr>
             <w:fldChar w:fldCharType="separate"/>
           </w:r>
-          <w:hyperlink w:anchor="__RefHeading___Toc5559_1460157198">
+          <w:hyperlink w:anchor="__RefHeading___Toc31288_3998045290">
             <w:r>
               <w:rPr>
                 <w:webHidden/>
@@ -181,7 +181,7 @@
             </w:tabs>
             <w:rPr/>
           </w:pPr>
-          <w:hyperlink w:anchor="__RefHeading___Toc5561_1460157198">
+          <w:hyperlink w:anchor="__RefHeading___Toc31290_3998045290">
             <w:r>
               <w:rPr>
                 <w:webHidden/>
@@ -202,7 +202,7 @@
             </w:tabs>
             <w:rPr/>
           </w:pPr>
-          <w:hyperlink w:anchor="__RefHeading___Toc5563_1460157198">
+          <w:hyperlink w:anchor="__RefHeading___Toc31292_3998045290">
             <w:r>
               <w:rPr>
                 <w:webHidden/>
@@ -223,7 +223,7 @@
             </w:tabs>
             <w:rPr/>
           </w:pPr>
-          <w:hyperlink w:anchor="__RefHeading___Toc5565_1460157198">
+          <w:hyperlink w:anchor="__RefHeading___Toc31294_3998045290">
             <w:r>
               <w:rPr>
                 <w:webHidden/>
@@ -244,7 +244,7 @@
             </w:tabs>
             <w:rPr/>
           </w:pPr>
-          <w:hyperlink w:anchor="__RefHeading___Toc5567_1460157198">
+          <w:hyperlink w:anchor="__RefHeading___Toc31296_3998045290">
             <w:r>
               <w:rPr>
                 <w:webHidden/>
@@ -265,7 +265,7 @@
             </w:tabs>
             <w:rPr/>
           </w:pPr>
-          <w:hyperlink w:anchor="__RefHeading___Toc5569_1460157198">
+          <w:hyperlink w:anchor="__RefHeading___Toc31298_3998045290">
             <w:r>
               <w:rPr>
                 <w:webHidden/>
@@ -286,7 +286,7 @@
             </w:tabs>
             <w:rPr/>
           </w:pPr>
-          <w:hyperlink w:anchor="__RefHeading___Toc5571_1460157198">
+          <w:hyperlink w:anchor="__RefHeading___Toc31300_3998045290">
             <w:r>
               <w:rPr>
                 <w:webHidden/>
@@ -307,7 +307,7 @@
             </w:tabs>
             <w:rPr/>
           </w:pPr>
-          <w:hyperlink w:anchor="__RefHeading___Toc5573_1460157198">
+          <w:hyperlink w:anchor="__RefHeading___Toc31302_3998045290">
             <w:r>
               <w:rPr>
                 <w:webHidden/>
@@ -328,7 +328,7 @@
             </w:tabs>
             <w:rPr/>
           </w:pPr>
-          <w:hyperlink w:anchor="__RefHeading___Toc5575_1460157198">
+          <w:hyperlink w:anchor="__RefHeading___Toc31304_3998045290">
             <w:r>
               <w:rPr>
                 <w:webHidden/>
@@ -349,7 +349,7 @@
             </w:tabs>
             <w:rPr/>
           </w:pPr>
-          <w:hyperlink w:anchor="__RefHeading___Toc5577_1460157198">
+          <w:hyperlink w:anchor="__RefHeading___Toc31306_3998045290">
             <w:r>
               <w:rPr>
                 <w:webHidden/>
@@ -370,7 +370,7 @@
             </w:tabs>
             <w:rPr/>
           </w:pPr>
-          <w:hyperlink w:anchor="__RefHeading___Toc5579_1460157198">
+          <w:hyperlink w:anchor="__RefHeading___Toc31308_3998045290">
             <w:r>
               <w:rPr>
                 <w:webHidden/>
@@ -391,7 +391,7 @@
             </w:tabs>
             <w:rPr/>
           </w:pPr>
-          <w:hyperlink w:anchor="__RefHeading___Toc5581_1460157198">
+          <w:hyperlink w:anchor="__RefHeading___Toc31310_3998045290">
             <w:r>
               <w:rPr>
                 <w:webHidden/>
@@ -412,7 +412,7 @@
             </w:tabs>
             <w:rPr/>
           </w:pPr>
-          <w:hyperlink w:anchor="__RefHeading___Toc5583_1460157198">
+          <w:hyperlink w:anchor="__RefHeading___Toc31312_3998045290">
             <w:r>
               <w:rPr>
                 <w:webHidden/>
@@ -433,7 +433,7 @@
             </w:tabs>
             <w:rPr/>
           </w:pPr>
-          <w:hyperlink w:anchor="__RefHeading___Toc5585_1460157198">
+          <w:hyperlink w:anchor="__RefHeading___Toc31314_3998045290">
             <w:r>
               <w:rPr>
                 <w:webHidden/>
@@ -454,7 +454,7 @@
             </w:tabs>
             <w:rPr/>
           </w:pPr>
-          <w:hyperlink w:anchor="__RefHeading___Toc5587_1460157198">
+          <w:hyperlink w:anchor="__RefHeading___Toc31316_3998045290">
             <w:r>
               <w:rPr>
                 <w:webHidden/>
@@ -475,7 +475,7 @@
             </w:tabs>
             <w:rPr/>
           </w:pPr>
-          <w:hyperlink w:anchor="__RefHeading___Toc5589_1460157198">
+          <w:hyperlink w:anchor="__RefHeading___Toc31318_3998045290">
             <w:r>
               <w:rPr>
                 <w:webHidden/>
@@ -496,7 +496,7 @@
             </w:tabs>
             <w:rPr/>
           </w:pPr>
-          <w:hyperlink w:anchor="__RefHeading___Toc5591_1460157198">
+          <w:hyperlink w:anchor="__RefHeading___Toc31320_3998045290">
             <w:r>
               <w:rPr>
                 <w:webHidden/>
@@ -517,7 +517,7 @@
             </w:tabs>
             <w:rPr/>
           </w:pPr>
-          <w:hyperlink w:anchor="__RefHeading___Toc5593_1460157198">
+          <w:hyperlink w:anchor="__RefHeading___Toc31322_3998045290">
             <w:r>
               <w:rPr>
                 <w:webHidden/>
@@ -538,7 +538,7 @@
             </w:tabs>
             <w:rPr/>
           </w:pPr>
-          <w:hyperlink w:anchor="__RefHeading___Toc5595_1460157198">
+          <w:hyperlink w:anchor="__RefHeading___Toc31324_3998045290">
             <w:r>
               <w:rPr>
                 <w:webHidden/>
@@ -559,7 +559,7 @@
             </w:tabs>
             <w:rPr/>
           </w:pPr>
-          <w:hyperlink w:anchor="__RefHeading___Toc5597_1460157198">
+          <w:hyperlink w:anchor="__RefHeading___Toc31326_3998045290">
             <w:r>
               <w:rPr>
                 <w:webHidden/>
@@ -580,7 +580,7 @@
             </w:tabs>
             <w:rPr/>
           </w:pPr>
-          <w:hyperlink w:anchor="__RefHeading___Toc5599_1460157198">
+          <w:hyperlink w:anchor="__RefHeading___Toc31328_3998045290">
             <w:r>
               <w:rPr>
                 <w:webHidden/>
@@ -601,7 +601,7 @@
             </w:tabs>
             <w:rPr/>
           </w:pPr>
-          <w:hyperlink w:anchor="__RefHeading___Toc5601_1460157198">
+          <w:hyperlink w:anchor="__RefHeading___Toc31330_3998045290">
             <w:r>
               <w:rPr>
                 <w:webHidden/>
@@ -622,7 +622,7 @@
             </w:tabs>
             <w:rPr/>
           </w:pPr>
-          <w:hyperlink w:anchor="__RefHeading___Toc5603_1460157198">
+          <w:hyperlink w:anchor="__RefHeading___Toc31332_3998045290">
             <w:r>
               <w:rPr>
                 <w:webHidden/>
@@ -643,7 +643,7 @@
             </w:tabs>
             <w:rPr/>
           </w:pPr>
-          <w:hyperlink w:anchor="__RefHeading___Toc5605_1460157198">
+          <w:hyperlink w:anchor="__RefHeading___Toc31334_3998045290">
             <w:r>
               <w:rPr>
                 <w:webHidden/>
@@ -664,7 +664,7 @@
             </w:tabs>
             <w:rPr/>
           </w:pPr>
-          <w:hyperlink w:anchor="__RefHeading___Toc5607_1460157198">
+          <w:hyperlink w:anchor="__RefHeading___Toc31336_3998045290">
             <w:r>
               <w:rPr>
                 <w:webHidden/>
@@ -685,7 +685,7 @@
             </w:tabs>
             <w:rPr/>
           </w:pPr>
-          <w:hyperlink w:anchor="__RefHeading___Toc5609_1460157198">
+          <w:hyperlink w:anchor="__RefHeading___Toc31338_3998045290">
             <w:r>
               <w:rPr>
                 <w:webHidden/>
@@ -706,7 +706,7 @@
             </w:tabs>
             <w:rPr/>
           </w:pPr>
-          <w:hyperlink w:anchor="__RefHeading___Toc5611_1460157198">
+          <w:hyperlink w:anchor="__RefHeading___Toc31340_3998045290">
             <w:r>
               <w:rPr>
                 <w:webHidden/>
@@ -727,7 +727,7 @@
             </w:tabs>
             <w:rPr/>
           </w:pPr>
-          <w:hyperlink w:anchor="__RefHeading___Toc5613_1460157198">
+          <w:hyperlink w:anchor="__RefHeading___Toc31342_3998045290">
             <w:r>
               <w:rPr>
                 <w:webHidden/>
@@ -748,7 +748,7 @@
             </w:tabs>
             <w:rPr/>
           </w:pPr>
-          <w:hyperlink w:anchor="__RefHeading___Toc5615_1460157198">
+          <w:hyperlink w:anchor="__RefHeading___Toc31344_3998045290">
             <w:r>
               <w:rPr>
                 <w:webHidden/>
@@ -769,7 +769,7 @@
             </w:tabs>
             <w:rPr/>
           </w:pPr>
-          <w:hyperlink w:anchor="__RefHeading___Toc5617_1460157198">
+          <w:hyperlink w:anchor="__RefHeading___Toc31346_3998045290">
             <w:r>
               <w:rPr>
                 <w:webHidden/>
@@ -790,7 +790,7 @@
             </w:tabs>
             <w:rPr/>
           </w:pPr>
-          <w:hyperlink w:anchor="__RefHeading___Toc5619_1460157198">
+          <w:hyperlink w:anchor="__RefHeading___Toc31348_3998045290">
             <w:r>
               <w:rPr>
                 <w:webHidden/>
@@ -811,7 +811,7 @@
             </w:tabs>
             <w:rPr/>
           </w:pPr>
-          <w:hyperlink w:anchor="__RefHeading___Toc5621_1460157198">
+          <w:hyperlink w:anchor="__RefHeading___Toc31350_3998045290">
             <w:r>
               <w:rPr>
                 <w:webHidden/>
@@ -832,7 +832,7 @@
             </w:tabs>
             <w:rPr/>
           </w:pPr>
-          <w:hyperlink w:anchor="__RefHeading___Toc5623_1460157198">
+          <w:hyperlink w:anchor="__RefHeading___Toc31352_3998045290">
             <w:r>
               <w:rPr>
                 <w:webHidden/>
@@ -853,7 +853,7 @@
             </w:tabs>
             <w:rPr/>
           </w:pPr>
-          <w:hyperlink w:anchor="__RefHeading___Toc5625_1460157198">
+          <w:hyperlink w:anchor="__RefHeading___Toc31354_3998045290">
             <w:r>
               <w:rPr>
                 <w:webHidden/>
@@ -874,7 +874,7 @@
             </w:tabs>
             <w:rPr/>
           </w:pPr>
-          <w:hyperlink w:anchor="__RefHeading___Toc5627_1460157198">
+          <w:hyperlink w:anchor="__RefHeading___Toc31356_3998045290">
             <w:r>
               <w:rPr>
                 <w:webHidden/>
@@ -895,7 +895,7 @@
             </w:tabs>
             <w:rPr/>
           </w:pPr>
-          <w:hyperlink w:anchor="__RefHeading___Toc5629_1460157198">
+          <w:hyperlink w:anchor="__RefHeading___Toc31358_3998045290">
             <w:r>
               <w:rPr>
                 <w:webHidden/>
@@ -916,7 +916,7 @@
             </w:tabs>
             <w:rPr/>
           </w:pPr>
-          <w:hyperlink w:anchor="__RefHeading___Toc5631_1460157198">
+          <w:hyperlink w:anchor="__RefHeading___Toc31360_3998045290">
             <w:r>
               <w:rPr>
                 <w:webHidden/>
@@ -937,7 +937,7 @@
             </w:tabs>
             <w:rPr/>
           </w:pPr>
-          <w:hyperlink w:anchor="__RefHeading___Toc5633_1460157198">
+          <w:hyperlink w:anchor="__RefHeading___Toc31362_3998045290">
             <w:r>
               <w:rPr>
                 <w:webHidden/>
@@ -958,7 +958,7 @@
             </w:tabs>
             <w:rPr/>
           </w:pPr>
-          <w:hyperlink w:anchor="__RefHeading___Toc5635_1460157198">
+          <w:hyperlink w:anchor="__RefHeading___Toc31364_3998045290">
             <w:r>
               <w:rPr>
                 <w:webHidden/>
@@ -979,7 +979,7 @@
             </w:tabs>
             <w:rPr/>
           </w:pPr>
-          <w:hyperlink w:anchor="__RefHeading___Toc5637_1460157198">
+          <w:hyperlink w:anchor="__RefHeading___Toc31366_3998045290">
             <w:r>
               <w:rPr>
                 <w:webHidden/>
@@ -1000,7 +1000,7 @@
             </w:tabs>
             <w:rPr/>
           </w:pPr>
-          <w:hyperlink w:anchor="__RefHeading___Toc5639_1460157198">
+          <w:hyperlink w:anchor="__RefHeading___Toc31368_3998045290">
             <w:r>
               <w:rPr>
                 <w:webHidden/>
@@ -1021,7 +1021,7 @@
             </w:tabs>
             <w:rPr/>
           </w:pPr>
-          <w:hyperlink w:anchor="__RefHeading___Toc5641_1460157198">
+          <w:hyperlink w:anchor="__RefHeading___Toc31370_3998045290">
             <w:r>
               <w:rPr>
                 <w:webHidden/>
@@ -1042,7 +1042,7 @@
             </w:tabs>
             <w:rPr/>
           </w:pPr>
-          <w:hyperlink w:anchor="__RefHeading___Toc5643_1460157198">
+          <w:hyperlink w:anchor="__RefHeading___Toc31372_3998045290">
             <w:r>
               <w:rPr>
                 <w:webHidden/>
@@ -1063,7 +1063,7 @@
             </w:tabs>
             <w:rPr/>
           </w:pPr>
-          <w:hyperlink w:anchor="__RefHeading___Toc5645_1460157198">
+          <w:hyperlink w:anchor="__RefHeading___Toc31374_3998045290">
             <w:r>
               <w:rPr>
                 <w:webHidden/>
@@ -1084,7 +1084,7 @@
             </w:tabs>
             <w:rPr/>
           </w:pPr>
-          <w:hyperlink w:anchor="__RefHeading___Toc5647_1460157198">
+          <w:hyperlink w:anchor="__RefHeading___Toc31376_3998045290">
             <w:r>
               <w:rPr>
                 <w:webHidden/>
@@ -1105,7 +1105,7 @@
             </w:tabs>
             <w:rPr/>
           </w:pPr>
-          <w:hyperlink w:anchor="__RefHeading___Toc5649_1460157198">
+          <w:hyperlink w:anchor="__RefHeading___Toc31378_3998045290">
             <w:r>
               <w:rPr>
                 <w:webHidden/>
@@ -1126,7 +1126,7 @@
             </w:tabs>
             <w:rPr/>
           </w:pPr>
-          <w:hyperlink w:anchor="__RefHeading___Toc5651_1460157198">
+          <w:hyperlink w:anchor="__RefHeading___Toc31380_3998045290">
             <w:r>
               <w:rPr>
                 <w:webHidden/>
@@ -1147,7 +1147,7 @@
             </w:tabs>
             <w:rPr/>
           </w:pPr>
-          <w:hyperlink w:anchor="__RefHeading___Toc5653_1460157198">
+          <w:hyperlink w:anchor="__RefHeading___Toc31382_3998045290">
             <w:r>
               <w:rPr>
                 <w:webHidden/>
@@ -1168,7 +1168,7 @@
             </w:tabs>
             <w:rPr/>
           </w:pPr>
-          <w:hyperlink w:anchor="__RefHeading___Toc5655_1460157198">
+          <w:hyperlink w:anchor="__RefHeading___Toc31384_3998045290">
             <w:r>
               <w:rPr>
                 <w:webHidden/>
@@ -1189,7 +1189,7 @@
             </w:tabs>
             <w:rPr/>
           </w:pPr>
-          <w:hyperlink w:anchor="__RefHeading___Toc5657_1460157198">
+          <w:hyperlink w:anchor="__RefHeading___Toc31386_3998045290">
             <w:r>
               <w:rPr>
                 <w:webHidden/>
@@ -1210,7 +1210,7 @@
             </w:tabs>
             <w:rPr/>
           </w:pPr>
-          <w:hyperlink w:anchor="__RefHeading___Toc5659_1460157198">
+          <w:hyperlink w:anchor="__RefHeading___Toc31388_3998045290">
             <w:r>
               <w:rPr>
                 <w:webHidden/>
@@ -1231,7 +1231,7 @@
             </w:tabs>
             <w:rPr/>
           </w:pPr>
-          <w:hyperlink w:anchor="__RefHeading___Toc5661_1460157198">
+          <w:hyperlink w:anchor="__RefHeading___Toc31390_3998045290">
             <w:r>
               <w:rPr>
                 <w:webHidden/>
@@ -1252,7 +1252,7 @@
             </w:tabs>
             <w:rPr/>
           </w:pPr>
-          <w:hyperlink w:anchor="__RefHeading___Toc5663_1460157198">
+          <w:hyperlink w:anchor="__RefHeading___Toc31392_3998045290">
             <w:r>
               <w:rPr>
                 <w:webHidden/>
@@ -1273,7 +1273,7 @@
             </w:tabs>
             <w:rPr/>
           </w:pPr>
-          <w:hyperlink w:anchor="__RefHeading___Toc5665_1460157198">
+          <w:hyperlink w:anchor="__RefHeading___Toc31394_3998045290">
             <w:r>
               <w:rPr>
                 <w:webHidden/>
@@ -1294,7 +1294,7 @@
             </w:tabs>
             <w:rPr/>
           </w:pPr>
-          <w:hyperlink w:anchor="__RefHeading___Toc5667_1460157198">
+          <w:hyperlink w:anchor="__RefHeading___Toc31396_3998045290">
             <w:r>
               <w:rPr>
                 <w:webHidden/>
@@ -1315,7 +1315,7 @@
             </w:tabs>
             <w:rPr/>
           </w:pPr>
-          <w:hyperlink w:anchor="__RefHeading___Toc5669_1460157198">
+          <w:hyperlink w:anchor="__RefHeading___Toc31398_3998045290">
             <w:r>
               <w:rPr>
                 <w:webHidden/>
@@ -1336,7 +1336,7 @@
             </w:tabs>
             <w:rPr/>
           </w:pPr>
-          <w:hyperlink w:anchor="__RefHeading___Toc5671_1460157198">
+          <w:hyperlink w:anchor="__RefHeading___Toc31400_3998045290">
             <w:r>
               <w:rPr>
                 <w:webHidden/>
@@ -1357,7 +1357,7 @@
             </w:tabs>
             <w:rPr/>
           </w:pPr>
-          <w:hyperlink w:anchor="__RefHeading___Toc5673_1460157198">
+          <w:hyperlink w:anchor="__RefHeading___Toc31402_3998045290">
             <w:r>
               <w:rPr>
                 <w:webHidden/>
@@ -1378,7 +1378,7 @@
             </w:tabs>
             <w:rPr/>
           </w:pPr>
-          <w:hyperlink w:anchor="__RefHeading___Toc5675_1460157198">
+          <w:hyperlink w:anchor="__RefHeading___Toc31404_3998045290">
             <w:r>
               <w:rPr>
                 <w:webHidden/>
@@ -1399,7 +1399,7 @@
             </w:tabs>
             <w:rPr/>
           </w:pPr>
-          <w:hyperlink w:anchor="__RefHeading___Toc5677_1460157198">
+          <w:hyperlink w:anchor="__RefHeading___Toc31406_3998045290">
             <w:r>
               <w:rPr>
                 <w:webHidden/>
@@ -1420,7 +1420,7 @@
             </w:tabs>
             <w:rPr/>
           </w:pPr>
-          <w:hyperlink w:anchor="__RefHeading___Toc5679_1460157198">
+          <w:hyperlink w:anchor="__RefHeading___Toc31408_3998045290">
             <w:r>
               <w:rPr>
                 <w:webHidden/>
@@ -1441,7 +1441,7 @@
             </w:tabs>
             <w:rPr/>
           </w:pPr>
-          <w:hyperlink w:anchor="__RefHeading___Toc5681_1460157198">
+          <w:hyperlink w:anchor="__RefHeading___Toc31410_3998045290">
             <w:r>
               <w:rPr>
                 <w:webHidden/>
@@ -1462,7 +1462,7 @@
             </w:tabs>
             <w:rPr/>
           </w:pPr>
-          <w:hyperlink w:anchor="__RefHeading___Toc5683_1460157198">
+          <w:hyperlink w:anchor="__RefHeading___Toc31412_3998045290">
             <w:r>
               <w:rPr>
                 <w:webHidden/>
@@ -1483,7 +1483,7 @@
             </w:tabs>
             <w:rPr/>
           </w:pPr>
-          <w:hyperlink w:anchor="__RefHeading___Toc5685_1460157198">
+          <w:hyperlink w:anchor="__RefHeading___Toc31414_3998045290">
             <w:r>
               <w:rPr>
                 <w:webHidden/>
@@ -1504,7 +1504,7 @@
             </w:tabs>
             <w:rPr/>
           </w:pPr>
-          <w:hyperlink w:anchor="__RefHeading___Toc5687_1460157198">
+          <w:hyperlink w:anchor="__RefHeading___Toc31416_3998045290">
             <w:r>
               <w:rPr>
                 <w:webHidden/>
@@ -1525,7 +1525,7 @@
             </w:tabs>
             <w:rPr/>
           </w:pPr>
-          <w:hyperlink w:anchor="__RefHeading___Toc5689_1460157198">
+          <w:hyperlink w:anchor="__RefHeading___Toc31418_3998045290">
             <w:r>
               <w:rPr>
                 <w:webHidden/>
@@ -1546,7 +1546,7 @@
             </w:tabs>
             <w:rPr/>
           </w:pPr>
-          <w:hyperlink w:anchor="__RefHeading___Toc5691_1460157198">
+          <w:hyperlink w:anchor="__RefHeading___Toc31420_3998045290">
             <w:r>
               <w:rPr>
                 <w:webHidden/>
@@ -1567,7 +1567,7 @@
             </w:tabs>
             <w:rPr/>
           </w:pPr>
-          <w:hyperlink w:anchor="__RefHeading___Toc5693_1460157198">
+          <w:hyperlink w:anchor="__RefHeading___Toc31422_3998045290">
             <w:r>
               <w:rPr>
                 <w:webHidden/>
@@ -1588,7 +1588,7 @@
             </w:tabs>
             <w:rPr/>
           </w:pPr>
-          <w:hyperlink w:anchor="__RefHeading___Toc5695_1460157198">
+          <w:hyperlink w:anchor="__RefHeading___Toc31424_3998045290">
             <w:r>
               <w:rPr>
                 <w:webHidden/>
@@ -1609,7 +1609,7 @@
             </w:tabs>
             <w:rPr/>
           </w:pPr>
-          <w:hyperlink w:anchor="__RefHeading___Toc5697_1460157198">
+          <w:hyperlink w:anchor="__RefHeading___Toc31426_3998045290">
             <w:r>
               <w:rPr>
                 <w:webHidden/>
@@ -1630,7 +1630,7 @@
             </w:tabs>
             <w:rPr/>
           </w:pPr>
-          <w:hyperlink w:anchor="__RefHeading___Toc5699_1460157198">
+          <w:hyperlink w:anchor="__RefHeading___Toc31428_3998045290">
             <w:r>
               <w:rPr>
                 <w:webHidden/>
@@ -1651,7 +1651,7 @@
             </w:tabs>
             <w:rPr/>
           </w:pPr>
-          <w:hyperlink w:anchor="__RefHeading___Toc5701_1460157198">
+          <w:hyperlink w:anchor="__RefHeading___Toc31430_3998045290">
             <w:r>
               <w:rPr>
                 <w:webHidden/>
@@ -1672,7 +1672,7 @@
             </w:tabs>
             <w:rPr/>
           </w:pPr>
-          <w:hyperlink w:anchor="__RefHeading___Toc5703_1460157198">
+          <w:hyperlink w:anchor="__RefHeading___Toc31432_3998045290">
             <w:r>
               <w:rPr>
                 <w:webHidden/>
@@ -1693,7 +1693,7 @@
             </w:tabs>
             <w:rPr/>
           </w:pPr>
-          <w:hyperlink w:anchor="__RefHeading___Toc5705_1460157198">
+          <w:hyperlink w:anchor="__RefHeading___Toc31434_3998045290">
             <w:r>
               <w:rPr>
                 <w:webHidden/>
@@ -1714,7 +1714,7 @@
             </w:tabs>
             <w:rPr/>
           </w:pPr>
-          <w:hyperlink w:anchor="__RefHeading___Toc5707_1460157198">
+          <w:hyperlink w:anchor="__RefHeading___Toc31436_3998045290">
             <w:r>
               <w:rPr>
                 <w:webHidden/>
@@ -1735,7 +1735,7 @@
             </w:tabs>
             <w:rPr/>
           </w:pPr>
-          <w:hyperlink w:anchor="__RefHeading___Toc5709_1460157198">
+          <w:hyperlink w:anchor="__RefHeading___Toc31438_3998045290">
             <w:r>
               <w:rPr>
                 <w:webHidden/>
@@ -1756,7 +1756,7 @@
             </w:tabs>
             <w:rPr/>
           </w:pPr>
-          <w:hyperlink w:anchor="__RefHeading___Toc5711_1460157198">
+          <w:hyperlink w:anchor="__RefHeading___Toc31440_3998045290">
             <w:r>
               <w:rPr>
                 <w:webHidden/>
@@ -1777,7 +1777,7 @@
             </w:tabs>
             <w:rPr/>
           </w:pPr>
-          <w:hyperlink w:anchor="__RefHeading___Toc5713_1460157198">
+          <w:hyperlink w:anchor="__RefHeading___Toc31442_3998045290">
             <w:r>
               <w:rPr>
                 <w:webHidden/>
@@ -1798,7 +1798,7 @@
             </w:tabs>
             <w:rPr/>
           </w:pPr>
-          <w:hyperlink w:anchor="__RefHeading___Toc5715_1460157198">
+          <w:hyperlink w:anchor="__RefHeading___Toc31444_3998045290">
             <w:r>
               <w:rPr>
                 <w:webHidden/>
@@ -1819,7 +1819,7 @@
             </w:tabs>
             <w:rPr/>
           </w:pPr>
-          <w:hyperlink w:anchor="__RefHeading___Toc5717_1460157198">
+          <w:hyperlink w:anchor="__RefHeading___Toc31446_3998045290">
             <w:r>
               <w:rPr>
                 <w:webHidden/>
@@ -1840,7 +1840,7 @@
             </w:tabs>
             <w:rPr/>
           </w:pPr>
-          <w:hyperlink w:anchor="__RefHeading___Toc5719_1460157198">
+          <w:hyperlink w:anchor="__RefHeading___Toc31448_3998045290">
             <w:r>
               <w:rPr>
                 <w:webHidden/>
@@ -1861,7 +1861,7 @@
             </w:tabs>
             <w:rPr/>
           </w:pPr>
-          <w:hyperlink w:anchor="__RefHeading___Toc5721_1460157198">
+          <w:hyperlink w:anchor="__RefHeading___Toc31450_3998045290">
             <w:r>
               <w:rPr>
                 <w:webHidden/>
@@ -1882,7 +1882,7 @@
             </w:tabs>
             <w:rPr/>
           </w:pPr>
-          <w:hyperlink w:anchor="__RefHeading___Toc5723_1460157198">
+          <w:hyperlink w:anchor="__RefHeading___Toc31452_3998045290">
             <w:r>
               <w:rPr>
                 <w:webHidden/>
@@ -1903,7 +1903,7 @@
             </w:tabs>
             <w:rPr/>
           </w:pPr>
-          <w:hyperlink w:anchor="__RefHeading___Toc5725_1460157198">
+          <w:hyperlink w:anchor="__RefHeading___Toc31454_3998045290">
             <w:r>
               <w:rPr>
                 <w:webHidden/>
@@ -1924,7 +1924,7 @@
             </w:tabs>
             <w:rPr/>
           </w:pPr>
-          <w:hyperlink w:anchor="__RefHeading___Toc5727_1460157198">
+          <w:hyperlink w:anchor="__RefHeading___Toc31456_3998045290">
             <w:r>
               <w:rPr>
                 <w:webHidden/>
@@ -1945,7 +1945,7 @@
             </w:tabs>
             <w:rPr/>
           </w:pPr>
-          <w:hyperlink w:anchor="__RefHeading___Toc5729_1460157198">
+          <w:hyperlink w:anchor="__RefHeading___Toc31458_3998045290">
             <w:r>
               <w:rPr>
                 <w:webHidden/>
@@ -1966,7 +1966,7 @@
             </w:tabs>
             <w:rPr/>
           </w:pPr>
-          <w:hyperlink w:anchor="__RefHeading___Toc5731_1460157198">
+          <w:hyperlink w:anchor="__RefHeading___Toc31460_3998045290">
             <w:r>
               <w:rPr>
                 <w:webHidden/>
@@ -1987,7 +1987,7 @@
             </w:tabs>
             <w:rPr/>
           </w:pPr>
-          <w:hyperlink w:anchor="__RefHeading___Toc5733_1460157198">
+          <w:hyperlink w:anchor="__RefHeading___Toc31462_3998045290">
             <w:r>
               <w:rPr>
                 <w:webHidden/>
@@ -2008,7 +2008,7 @@
             </w:tabs>
             <w:rPr/>
           </w:pPr>
-          <w:hyperlink w:anchor="__RefHeading___Toc5735_1460157198">
+          <w:hyperlink w:anchor="__RefHeading___Toc31464_3998045290">
             <w:r>
               <w:rPr>
                 <w:webHidden/>
@@ -3245,7 +3245,7 @@
         <w:spacing w:before="0" w:after="120"/>
         <w:rPr/>
       </w:pPr>
-      <w:bookmarkStart w:id="2" w:name="__RefHeading___Toc5559_1460157198"/>
+      <w:bookmarkStart w:id="2" w:name="__RefHeading___Toc31288_3998045290"/>
       <w:bookmarkEnd w:id="2"/>
       <w:r>
         <w:rPr>
@@ -3383,7 +3383,7 @@
         <w:spacing w:before="360" w:after="120"/>
         <w:rPr/>
       </w:pPr>
-      <w:bookmarkStart w:id="4" w:name="__RefHeading___Toc5561_1460157198"/>
+      <w:bookmarkStart w:id="4" w:name="__RefHeading___Toc31290_3998045290"/>
       <w:bookmarkStart w:id="5" w:name="document-information"/>
       <w:bookmarkEnd w:id="4"/>
       <w:r>
@@ -3415,7 +3415,7 @@
         <w:spacing w:before="280" w:after="80"/>
         <w:rPr/>
       </w:pPr>
-      <w:bookmarkStart w:id="6" w:name="__RefHeading___Toc5563_1460157198"/>
+      <w:bookmarkStart w:id="6" w:name="__RefHeading___Toc31292_3998045290"/>
       <w:bookmarkEnd w:id="6"/>
       <w:r>
         <w:rPr>
@@ -3884,7 +3884,7 @@
       <w:r>
         <w:br w:type="page"/>
       </w:r>
-      <w:bookmarkStart w:id="9" w:name="__RefHeading___Toc5565_1460157198"/>
+      <w:bookmarkStart w:id="9" w:name="__RefHeading___Toc31294_3998045290"/>
       <w:bookmarkEnd w:id="9"/>
       <w:r>
         <w:rPr>
@@ -4574,7 +4574,7 @@
       <w:r>
         <w:br w:type="page"/>
       </w:r>
-      <w:bookmarkStart w:id="11" w:name="__RefHeading___Toc5567_1460157198"/>
+      <w:bookmarkStart w:id="11" w:name="__RefHeading___Toc31296_3998045290"/>
       <w:bookmarkEnd w:id="11"/>
       <w:r>
         <w:rPr>
@@ -4673,7 +4673,7 @@
         <w:spacing w:before="280" w:after="80"/>
         <w:rPr/>
       </w:pPr>
-      <w:bookmarkStart w:id="12" w:name="__RefHeading___Toc5569_1460157198"/>
+      <w:bookmarkStart w:id="12" w:name="__RefHeading___Toc31298_3998045290"/>
       <w:bookmarkStart w:id="13" w:name="intended-audience"/>
       <w:bookmarkEnd w:id="12"/>
       <w:r>
@@ -4751,7 +4751,7 @@
         <w:spacing w:before="280" w:after="80"/>
         <w:rPr/>
       </w:pPr>
-      <w:bookmarkStart w:id="15" w:name="__RefHeading___Toc5571_1460157198"/>
+      <w:bookmarkStart w:id="15" w:name="__RefHeading___Toc31300_3998045290"/>
       <w:bookmarkStart w:id="16" w:name="related-documents"/>
       <w:bookmarkEnd w:id="15"/>
       <w:r>
@@ -4956,7 +4956,7 @@
         <w:spacing w:before="360" w:after="120"/>
         <w:rPr/>
       </w:pPr>
-      <w:bookmarkStart w:id="19" w:name="__RefHeading___Toc5573_1460157198"/>
+      <w:bookmarkStart w:id="19" w:name="__RefHeading___Toc31302_3998045290"/>
       <w:bookmarkStart w:id="20" w:name="what-the-generator-produces"/>
       <w:bookmarkEnd w:id="19"/>
       <w:r>
@@ -5028,7 +5028,7 @@
         <w:spacing w:before="280" w:after="80"/>
         <w:rPr/>
       </w:pPr>
-      <w:bookmarkStart w:id="21" w:name="__RefHeading___Toc5575_1460157198"/>
+      <w:bookmarkStart w:id="21" w:name="__RefHeading___Toc31304_3998045290"/>
       <w:bookmarkEnd w:id="21"/>
       <w:r>
         <w:rPr>
@@ -5687,7 +5687,7 @@
       <w:r>
         <w:br w:type="page"/>
       </w:r>
-      <w:bookmarkStart w:id="24" w:name="__RefHeading___Toc5577_1460157198"/>
+      <w:bookmarkStart w:id="24" w:name="__RefHeading___Toc31306_3998045290"/>
       <w:bookmarkEnd w:id="24"/>
       <w:r>
         <w:rPr>
@@ -6042,7 +6042,7 @@
         <w:spacing w:before="280" w:after="80"/>
         <w:rPr/>
       </w:pPr>
-      <w:bookmarkStart w:id="25" w:name="__RefHeading___Toc5579_1460157198"/>
+      <w:bookmarkStart w:id="25" w:name="__RefHeading___Toc31308_3998045290"/>
       <w:bookmarkStart w:id="26" w:name="topology-status"/>
       <w:bookmarkEnd w:id="25"/>
       <w:r>
@@ -6331,7 +6331,7 @@
         <w:spacing w:before="360" w:after="120"/>
         <w:rPr/>
       </w:pPr>
-      <w:bookmarkStart w:id="29" w:name="__RefHeading___Toc5581_1460157198"/>
+      <w:bookmarkStart w:id="29" w:name="__RefHeading___Toc31310_3998045290"/>
       <w:bookmarkStart w:id="30" w:name="when-to-regenerate"/>
       <w:bookmarkEnd w:id="29"/>
       <w:r>
@@ -6443,7 +6443,7 @@
         <w:spacing w:before="280" w:after="80"/>
         <w:rPr/>
       </w:pPr>
-      <w:bookmarkStart w:id="31" w:name="__RefHeading___Toc5583_1460157198"/>
+      <w:bookmarkStart w:id="31" w:name="__RefHeading___Toc31312_3998045290"/>
       <w:bookmarkStart w:id="32" w:name="standard-regeneration-workflow"/>
       <w:bookmarkEnd w:id="31"/>
       <w:r>
@@ -6658,7 +6658,7 @@
         <w:spacing w:before="280" w:after="80"/>
         <w:rPr/>
       </w:pPr>
-      <w:bookmarkStart w:id="33" w:name="__RefHeading___Toc5585_1460157198"/>
+      <w:bookmarkStart w:id="33" w:name="__RefHeading___Toc31314_3998045290"/>
       <w:bookmarkStart w:id="34" w:name="pre-generated-vs-custom"/>
       <w:bookmarkEnd w:id="33"/>
       <w:r>
@@ -6791,7 +6791,7 @@
         <w:spacing w:before="360" w:after="120"/>
         <w:rPr/>
       </w:pPr>
-      <w:bookmarkStart w:id="37" w:name="__RefHeading___Toc5587_1460157198"/>
+      <w:bookmarkStart w:id="37" w:name="__RefHeading___Toc31316_3998045290"/>
       <w:bookmarkStart w:id="38" w:name="generator-entry-points"/>
       <w:bookmarkEnd w:id="37"/>
       <w:r>
@@ -6823,7 +6823,7 @@
         <w:spacing w:before="280" w:after="80"/>
         <w:rPr/>
       </w:pPr>
-      <w:bookmarkStart w:id="39" w:name="__RefHeading___Toc5589_1460157198"/>
+      <w:bookmarkStart w:id="39" w:name="__RefHeading___Toc31318_3998045290"/>
       <w:bookmarkStart w:id="40" w:name="flat-crossbar-generator"/>
       <w:bookmarkEnd w:id="39"/>
       <w:r>
@@ -6937,7 +6937,7 @@
         <w:spacing w:before="280" w:after="80"/>
         <w:rPr/>
       </w:pPr>
-      <w:bookmarkStart w:id="42" w:name="__RefHeading___Toc5591_1460157198"/>
+      <w:bookmarkStart w:id="42" w:name="__RefHeading___Toc31320_3998045290"/>
       <w:bookmarkStart w:id="43" w:name="tree-primitives-generator"/>
       <w:bookmarkEnd w:id="42"/>
       <w:r>
@@ -7118,7 +7118,7 @@
         <w:spacing w:before="280" w:after="80"/>
         <w:rPr/>
       </w:pPr>
-      <w:bookmarkStart w:id="44" w:name="__RefHeading___Toc5593_1460157198"/>
+      <w:bookmarkStart w:id="44" w:name="__RefHeading___Toc31322_3998045290"/>
       <w:bookmarkStart w:id="45" w:name="programmatic-api"/>
       <w:bookmarkEnd w:id="44"/>
       <w:r>
@@ -7746,7 +7746,7 @@
         <w:spacing w:before="360" w:after="120"/>
         <w:rPr/>
       </w:pPr>
-      <w:bookmarkStart w:id="48" w:name="__RefHeading___Toc5595_1460157198"/>
+      <w:bookmarkStart w:id="48" w:name="__RefHeading___Toc31324_3998045290"/>
       <w:bookmarkStart w:id="49" w:name="cli-and-programmatic-api"/>
       <w:bookmarkEnd w:id="48"/>
       <w:r>
@@ -7778,7 +7778,7 @@
         <w:spacing w:before="280" w:after="80"/>
         <w:rPr/>
       </w:pPr>
-      <w:bookmarkStart w:id="50" w:name="__RefHeading___Toc5597_1460157198"/>
+      <w:bookmarkStart w:id="50" w:name="__RefHeading___Toc31326_3998045290"/>
       <w:bookmarkEnd w:id="50"/>
       <w:r>
         <w:rPr>
@@ -9201,7 +9201,7 @@
       <w:r>
         <w:br w:type="page"/>
       </w:r>
-      <w:bookmarkStart w:id="53" w:name="__RefHeading___Toc5599_1460157198"/>
+      <w:bookmarkStart w:id="53" w:name="__RefHeading___Toc31328_3998045290"/>
       <w:bookmarkEnd w:id="53"/>
       <w:r>
         <w:rPr>
@@ -10178,7 +10178,7 @@
       </w:r>
       <w:r>
         <w:rPr/>
-        <w:t xml:space="preserve"> knob selects register-file (</w:t>
+        <w:t xml:space="preserve"> knob accepts only </w:t>
       </w:r>
       <w:r>
         <w:rPr>
@@ -10188,7 +10188,7 @@
       </w:r>
       <w:r>
         <w:rPr/>
-        <w:t>, default) or SRAM (</w:t>
+        <w:t xml:space="preserve"> (default) in mesh mode — </w:t>
       </w:r>
       <w:r>
         <w:rPr>
@@ -10198,7 +10198,17 @@
       </w:r>
       <w:r>
         <w:rPr/>
-        <w:t>) input buffers; the SRAM option is not yet wired to the cell (issue #118).</w:t>
+        <w:t xml:space="preserve"> is rejected at validation (issue #118: the BRAM registered-read path hangs the drop FSM). </w:t>
+      </w:r>
+      <w:r>
+        <w:rPr>
+          <w:rStyle w:val="VerbatimChar"/>
+        </w:rPr>
+        <w:t>--amba5</w:t>
+      </w:r>
+      <w:r>
+        <w:rPr/>
+        <w:t xml:space="preserve"> is likewise rejected in mesh mode (flat mode only in v1).</w:t>
       </w:r>
     </w:p>
     <w:p>
@@ -10254,12 +10264,52 @@
       </w:r>
       <w:r>
         <w:rPr/>
-        <w:t xml:space="preserve"> with native AMBA 5 CXS flit ports (Issue D framing, credit grant/return, activation handshake) so a CXS rapids attaches without adapters. The §4 header content rides the flit sideband in both modes. Mesh credit sidebands remain the inter-cell flow control; CXS link credit is the plane’s port-level mechanism. </w:t>
+        <w:t xml:space="preserve"> with native AMBA 5 CXS flit ports (Issue D framing, credit grant/return, activation handshake) so a CXS rapids attaches without adapters. CXS mode requires </w:t>
       </w:r>
       <w:r>
         <w:rPr>
           <w:rStyle w:val="VerbatimChar"/>
         </w:rPr>
+        <w:t>--data-width 256/512/1024/2048</w:t>
+      </w:r>
+      <w:r>
+        <w:rPr/>
+        <w:t xml:space="preserve"> — AMBA CXS multi-packet flits (</w:t>
+      </w:r>
+      <w:r>
+        <w:rPr>
+          <w:rStyle w:val="VerbatimChar"/>
+        </w:rPr>
+        <w:t>CXSMAXPKTPERFLIT &gt;= 2</w:t>
+      </w:r>
+      <w:r>
+        <w:rPr/>
+        <w:t xml:space="preserve">, required for TLAST framing) restrict </w:t>
+      </w:r>
+      <w:r>
+        <w:rPr>
+          <w:rStyle w:val="VerbatimChar"/>
+        </w:rPr>
+        <w:t>CXSDATAWIDTH</w:t>
+      </w:r>
+      <w:r>
+        <w:rPr/>
+        <w:t xml:space="preserve"> to those values (</w:t>
+      </w:r>
+      <w:r>
+        <w:rPr>
+          <w:rStyle w:val="VerbatimChar"/>
+        </w:rPr>
+        <w:t>cxs_pkg::config_error</w:t>
+      </w:r>
+      <w:r>
+        <w:rPr/>
+        <w:t xml:space="preserve"> rule 6); the generator rejects other widths. The §4 header content rides the flit sideband in both modes. Mesh credit sidebands remain the inter-cell flow control; CXS link credit is the plane’s port-level mechanism. </w:t>
+      </w:r>
+      <w:r>
+        <w:rPr>
+          <w:rStyle w:val="VerbatimChar"/>
+        </w:rPr>
         <w:t>axis</w:t>
       </w:r>
       <w:r>
@@ -10284,7 +10334,18 @@
       </w:r>
       <w:r>
         <w:rPr/>
-        <w:t>.</w:t>
+        <w:t xml:space="preserve">. </w:t>
+      </w:r>
+      <w:r>
+        <w:rPr>
+          <w:b/>
+          <w:bCs/>
+        </w:rPr>
+        <w:t>Scope:</w:t>
+      </w:r>
+      <w:r>
+        <w:rPr/>
+        <w:t xml:space="preserve"> CXS mode is validated for directed traffic (the dv suite scoreboards self/1-hop/2-hop multi-beat packets end to end); concurrent-load CXS shows a duplication/loss corner tracked as issue #122 — AXIS mode carries concurrent mesh behavior until #122 lands.</w:t>
       </w:r>
     </w:p>
     <w:p>
@@ -10325,7 +10386,7 @@
         <w:spacing w:before="280" w:after="80"/>
         <w:rPr/>
       </w:pPr>
-      <w:bookmarkStart w:id="55" w:name="__RefHeading___Toc5601_1460157198"/>
+      <w:bookmarkStart w:id="55" w:name="__RefHeading___Toc31330_3998045290"/>
       <w:bookmarkStart w:id="56" w:name="programmatic-api-1"/>
       <w:bookmarkEnd w:id="55"/>
       <w:r>
@@ -10842,7 +10903,7 @@
         <w:spacing w:before="280" w:after="80"/>
         <w:rPr/>
       </w:pPr>
-      <w:bookmarkStart w:id="57" w:name="__RefHeading___Toc5603_1460157198"/>
+      <w:bookmarkStart w:id="57" w:name="__RefHeading___Toc31332_3998045290"/>
       <w:bookmarkStart w:id="58" w:name="programmatic-api-for-mesh"/>
       <w:bookmarkEnd w:id="57"/>
       <w:r>
@@ -11486,7 +11547,7 @@
         <w:spacing w:before="360" w:after="120"/>
         <w:rPr/>
       </w:pPr>
-      <w:bookmarkStart w:id="61" w:name="__RefHeading___Toc5605_1460157198"/>
+      <w:bookmarkStart w:id="61" w:name="__RefHeading___Toc31334_3998045290"/>
       <w:bookmarkStart w:id="62" w:name="parameter-semantics"/>
       <w:bookmarkEnd w:id="61"/>
       <w:r>
@@ -11518,7 +11579,7 @@
         <w:spacing w:before="280" w:after="80"/>
         <w:rPr/>
       </w:pPr>
-      <w:bookmarkStart w:id="63" w:name="__RefHeading___Toc5607_1460157198"/>
+      <w:bookmarkStart w:id="63" w:name="__RefHeading___Toc31336_3998045290"/>
       <w:bookmarkEnd w:id="63"/>
       <w:r>
         <w:rPr>
@@ -12519,7 +12580,7 @@
       <w:r>
         <w:br w:type="page"/>
       </w:r>
-      <w:bookmarkStart w:id="66" w:name="__RefHeading___Toc5609_1460157198"/>
+      <w:bookmarkStart w:id="66" w:name="__RefHeading___Toc31338_3998045290"/>
       <w:bookmarkEnd w:id="66"/>
       <w:r>
         <w:rPr>
@@ -13498,7 +13559,7 @@
         <w:spacing w:before="360" w:after="120"/>
         <w:rPr/>
       </w:pPr>
-      <w:bookmarkStart w:id="69" w:name="__RefHeading___Toc5611_1460157198"/>
+      <w:bookmarkStart w:id="69" w:name="__RefHeading___Toc31340_3998045290"/>
       <w:bookmarkStart w:id="70" w:name="amba-5-tstrb-and-parity-options"/>
       <w:bookmarkEnd w:id="69"/>
       <w:r>
@@ -13530,7 +13591,7 @@
         <w:spacing w:before="280" w:after="80"/>
         <w:rPr/>
       </w:pPr>
-      <w:bookmarkStart w:id="71" w:name="__RefHeading___Toc5613_1460157198"/>
+      <w:bookmarkStart w:id="71" w:name="__RefHeading___Toc31342_3998045290"/>
       <w:bookmarkStart w:id="72" w:name="tstrb-byte-qualifiers"/>
       <w:bookmarkEnd w:id="71"/>
       <w:r>
@@ -13695,7 +13756,7 @@
         <w:spacing w:before="280" w:after="80"/>
         <w:rPr/>
       </w:pPr>
-      <w:bookmarkStart w:id="73" w:name="__RefHeading___Toc5615_1460157198"/>
+      <w:bookmarkStart w:id="73" w:name="__RefHeading___Toc31344_3998045290"/>
       <w:bookmarkStart w:id="74" w:name="amba-5-sidebands---amba5"/>
       <w:bookmarkEnd w:id="73"/>
       <w:r>
@@ -15262,7 +15323,7 @@
         <w:spacing w:before="200" w:after="80"/>
         <w:rPr/>
       </w:pPr>
-      <w:bookmarkStart w:id="76" w:name="__RefHeading___Toc5617_1460157198"/>
+      <w:bookmarkStart w:id="76" w:name="__RefHeading___Toc31346_3998045290"/>
       <w:bookmarkStart w:id="77" w:name="parity-rule"/>
       <w:bookmarkEnd w:id="76"/>
       <w:r>
@@ -15407,7 +15468,7 @@
         <w:spacing w:before="200" w:after="80"/>
         <w:rPr/>
       </w:pPr>
-      <w:bookmarkStart w:id="78" w:name="__RefHeading___Toc5619_1460157198"/>
+      <w:bookmarkStart w:id="78" w:name="__RefHeading___Toc31348_3998045290"/>
       <w:bookmarkStart w:id="79" w:name="who-generates-and-who-checks"/>
       <w:bookmarkEnd w:id="78"/>
       <w:r>
@@ -16391,7 +16452,7 @@
         <w:spacing w:before="200" w:after="80"/>
         <w:rPr/>
       </w:pPr>
-      <w:bookmarkStart w:id="82" w:name="__RefHeading___Toc5621_1460157198"/>
+      <w:bookmarkStart w:id="82" w:name="__RefHeading___Toc31350_3998045290"/>
       <w:bookmarkStart w:id="83" w:name="error-flags"/>
       <w:bookmarkEnd w:id="82"/>
       <w:r>
@@ -16517,7 +16578,7 @@
         <w:spacing w:before="200" w:after="80"/>
         <w:rPr/>
       </w:pPr>
-      <w:bookmarkStart w:id="84" w:name="__RefHeading___Toc5623_1460157198"/>
+      <w:bookmarkStart w:id="84" w:name="__RefHeading___Toc31352_3998045290"/>
       <w:bookmarkStart w:id="85" w:name="twakeup-steering"/>
       <w:bookmarkEnd w:id="84"/>
       <w:r>
@@ -16740,7 +16801,7 @@
         <w:spacing w:before="360" w:after="120"/>
         <w:rPr/>
       </w:pPr>
-      <w:bookmarkStart w:id="89" w:name="__RefHeading___Toc5625_1460157198"/>
+      <w:bookmarkStart w:id="89" w:name="__RefHeading___Toc31354_3998045290"/>
       <w:bookmarkStart w:id="90" w:name="validation-rules"/>
       <w:bookmarkEnd w:id="89"/>
       <w:r>
@@ -16812,7 +16873,7 @@
         <w:spacing w:before="280" w:after="80"/>
         <w:rPr/>
       </w:pPr>
-      <w:bookmarkStart w:id="91" w:name="__RefHeading___Toc5627_1460157198"/>
+      <w:bookmarkStart w:id="91" w:name="__RefHeading___Toc31356_3998045290"/>
       <w:bookmarkEnd w:id="91"/>
       <w:r>
         <w:rPr>
@@ -17916,7 +17977,7 @@
       <w:r>
         <w:br w:type="page"/>
       </w:r>
-      <w:bookmarkStart w:id="94" w:name="__RefHeading___Toc5629_1460157198"/>
+      <w:bookmarkStart w:id="94" w:name="__RefHeading___Toc31358_3998045290"/>
       <w:bookmarkEnd w:id="94"/>
       <w:r>
         <w:rPr>
@@ -18505,7 +18566,7 @@
         <w:spacing w:before="280" w:after="80"/>
         <w:rPr/>
       </w:pPr>
-      <w:bookmarkStart w:id="96" w:name="__RefHeading___Toc5631_1460157198"/>
+      <w:bookmarkStart w:id="96" w:name="__RefHeading___Toc31360_3998045290"/>
       <w:bookmarkStart w:id="97" w:name="mesh-topology-validation"/>
       <w:bookmarkEnd w:id="96"/>
       <w:r>
@@ -19301,7 +19362,7 @@
         <w:spacing w:before="200" w:after="80"/>
         <w:rPr/>
       </w:pPr>
-      <w:bookmarkStart w:id="99" w:name="__RefHeading___Toc5633_1460157198"/>
+      <w:bookmarkStart w:id="99" w:name="__RefHeading___Toc31362_3998045290"/>
       <w:bookmarkEnd w:id="99"/>
       <w:r>
         <w:rPr>
@@ -20187,7 +20248,7 @@
         <w:spacing w:before="360" w:after="120"/>
         <w:rPr/>
       </w:pPr>
-      <w:bookmarkStart w:id="103" w:name="__RefHeading___Toc5635_1460157198"/>
+      <w:bookmarkStart w:id="103" w:name="__RefHeading___Toc31364_3998045290"/>
       <w:bookmarkStart w:id="104" w:name="pipeline-overview"/>
       <w:bookmarkEnd w:id="103"/>
       <w:r>
@@ -20253,7 +20314,7 @@
         <w:spacing w:before="200" w:after="80"/>
         <w:rPr/>
       </w:pPr>
-      <w:bookmarkStart w:id="105" w:name="__RefHeading___Toc5637_1460157198"/>
+      <w:bookmarkStart w:id="105" w:name="__RefHeading___Toc31366_3998045290"/>
       <w:bookmarkStart w:id="106" w:name="figure-3.1-delta-generator-pipeline"/>
       <w:bookmarkStart w:id="107" w:name="_Fig_1_Delta_Generator_Pipe"/>
       <w:bookmarkEnd w:id="105"/>
@@ -20462,7 +20523,7 @@
         <w:spacing w:before="280" w:after="80"/>
         <w:rPr/>
       </w:pPr>
-      <w:bookmarkStart w:id="108" w:name="__RefHeading___Toc5639_1460157198"/>
+      <w:bookmarkStart w:id="108" w:name="__RefHeading___Toc31368_3998045290"/>
       <w:bookmarkStart w:id="109" w:name="stages"/>
       <w:bookmarkEnd w:id="108"/>
       <w:r>
@@ -21030,7 +21091,7 @@
         <w:spacing w:before="360" w:after="120"/>
         <w:rPr/>
       </w:pPr>
-      <w:bookmarkStart w:id="112" w:name="__RefHeading___Toc5641_1460157198"/>
+      <w:bookmarkStart w:id="112" w:name="__RefHeading___Toc31370_3998045290"/>
       <w:bookmarkStart w:id="113" w:name="request-decode"/>
       <w:bookmarkEnd w:id="112"/>
       <w:r>
@@ -21089,7 +21150,7 @@
         <w:spacing w:before="280" w:after="80"/>
         <w:rPr/>
       </w:pPr>
-      <w:bookmarkStart w:id="114" w:name="__RefHeading___Toc5643_1460157198"/>
+      <w:bookmarkStart w:id="114" w:name="__RefHeading___Toc31372_3998045290"/>
       <w:bookmarkStart w:id="115" w:name="request-matrix"/>
       <w:bookmarkEnd w:id="114"/>
       <w:r>
@@ -21425,7 +21486,7 @@
         <w:spacing w:before="280" w:after="80"/>
         <w:rPr/>
       </w:pPr>
-      <w:bookmarkStart w:id="116" w:name="__RefHeading___Toc5645_1460157198"/>
+      <w:bookmarkStart w:id="116" w:name="__RefHeading___Toc31374_3998045290"/>
       <w:bookmarkStart w:id="117" w:name="out-of-range-tdest"/>
       <w:bookmarkEnd w:id="116"/>
       <w:r>
@@ -21584,7 +21645,7 @@
         <w:spacing w:before="360" w:after="120"/>
         <w:rPr/>
       </w:pPr>
-      <w:bookmarkStart w:id="120" w:name="__RefHeading___Toc5647_1460157198"/>
+      <w:bookmarkStart w:id="120" w:name="__RefHeading___Toc31376_3998045290"/>
       <w:bookmarkStart w:id="121" w:name="arbitration-and-routing"/>
       <w:bookmarkEnd w:id="120"/>
       <w:r>
@@ -21616,7 +21677,7 @@
         <w:spacing w:before="280" w:after="80"/>
         <w:rPr/>
       </w:pPr>
-      <w:bookmarkStart w:id="122" w:name="__RefHeading___Toc5649_1460157198"/>
+      <w:bookmarkStart w:id="122" w:name="__RefHeading___Toc31378_3998045290"/>
       <w:bookmarkStart w:id="123" w:name="packet-atomic-round-robin-arbitration"/>
       <w:bookmarkEnd w:id="122"/>
       <w:r>
@@ -21877,7 +21938,7 @@
         <w:spacing w:before="280" w:after="80"/>
         <w:rPr/>
       </w:pPr>
-      <w:bookmarkStart w:id="124" w:name="__RefHeading___Toc5651_1460157198"/>
+      <w:bookmarkStart w:id="124" w:name="__RefHeading___Toc31380_3998045290"/>
       <w:bookmarkStart w:id="125" w:name="crossbar-mux"/>
       <w:bookmarkEnd w:id="124"/>
       <w:r>
@@ -22199,7 +22260,7 @@
         <w:spacing w:before="280" w:after="80"/>
         <w:rPr/>
       </w:pPr>
-      <w:bookmarkStart w:id="126" w:name="__RefHeading___Toc5653_1460157198"/>
+      <w:bookmarkStart w:id="126" w:name="__RefHeading___Toc31382_3998045290"/>
       <w:bookmarkStart w:id="127" w:name="backpressure-routing"/>
       <w:bookmarkEnd w:id="126"/>
       <w:r>
@@ -22588,7 +22649,7 @@
         <w:spacing w:before="360" w:after="120"/>
         <w:rPr/>
       </w:pPr>
-      <w:bookmarkStart w:id="130" w:name="__RefHeading___Toc5655_1460157198"/>
+      <w:bookmarkStart w:id="130" w:name="__RefHeading___Toc31384_3998045290"/>
       <w:bookmarkStart w:id="131" w:name="boundary-module-instantiation"/>
       <w:bookmarkEnd w:id="130"/>
       <w:r>
@@ -22660,7 +22721,7 @@
         <w:spacing w:before="280" w:after="80"/>
         <w:rPr/>
       </w:pPr>
-      <w:bookmarkStart w:id="132" w:name="__RefHeading___Toc5657_1460157198"/>
+      <w:bookmarkStart w:id="132" w:name="__RefHeading___Toc31386_3998045290"/>
       <w:bookmarkStart w:id="133" w:name="flat-crossbar"/>
       <w:bookmarkEnd w:id="132"/>
       <w:r>
@@ -22749,7 +22810,7 @@
         <w:spacing w:before="280" w:after="80"/>
         <w:rPr/>
       </w:pPr>
-      <w:bookmarkStart w:id="135" w:name="__RefHeading___Toc5659_1460157198"/>
+      <w:bookmarkStart w:id="135" w:name="__RefHeading___Toc31388_3998045290"/>
       <w:bookmarkStart w:id="136" w:name="tree-primitives"/>
       <w:bookmarkEnd w:id="135"/>
       <w:r>
@@ -23322,7 +23383,7 @@
         <w:spacing w:before="360" w:after="120"/>
         <w:rPr/>
       </w:pPr>
-      <w:bookmarkStart w:id="140" w:name="__RefHeading___Toc5661_1460157198"/>
+      <w:bookmarkStart w:id="140" w:name="__RefHeading___Toc31390_3998045290"/>
       <w:bookmarkStart w:id="141" w:name="directory-layout"/>
       <w:bookmarkEnd w:id="140"/>
       <w:r>
@@ -23601,7 +23662,7 @@
         <w:spacing w:before="360" w:after="120"/>
         <w:rPr/>
       </w:pPr>
-      <w:bookmarkStart w:id="143" w:name="__RefHeading___Toc5663_1460157198"/>
+      <w:bookmarkStart w:id="143" w:name="__RefHeading___Toc31392_3998045290"/>
       <w:bookmarkStart w:id="144" w:name="module-header-and-parameters"/>
       <w:bookmarkEnd w:id="143"/>
       <w:r>
@@ -23673,7 +23734,7 @@
         <w:spacing w:before="280" w:after="80"/>
         <w:rPr/>
       </w:pPr>
-      <w:bookmarkStart w:id="145" w:name="__RefHeading___Toc5665_1460157198"/>
+      <w:bookmarkStart w:id="145" w:name="__RefHeading___Toc31394_3998045290"/>
       <w:bookmarkStart w:id="146" w:name="header-comment"/>
       <w:bookmarkEnd w:id="145"/>
       <w:r>
@@ -23932,7 +23993,7 @@
         <w:spacing w:before="280" w:after="80"/>
         <w:rPr/>
       </w:pPr>
-      <w:bookmarkStart w:id="147" w:name="__RefHeading___Toc5667_1460157198"/>
+      <w:bookmarkStart w:id="147" w:name="__RefHeading___Toc31396_3998045290"/>
       <w:bookmarkStart w:id="148" w:name="port-naming-convention"/>
       <w:bookmarkEnd w:id="147"/>
       <w:r>
@@ -24525,7 +24586,7 @@
         <w:spacing w:before="360" w:after="120"/>
         <w:rPr/>
       </w:pPr>
-      <w:bookmarkStart w:id="152" w:name="__RefHeading___Toc5669_1460157198"/>
+      <w:bookmarkStart w:id="152" w:name="__RefHeading___Toc31398_3998045290"/>
       <w:bookmarkStart w:id="153" w:name="flat-crossbar-1"/>
       <w:bookmarkEnd w:id="152"/>
       <w:r>
@@ -24584,7 +24645,7 @@
         <w:spacing w:before="280" w:after="80"/>
         <w:rPr/>
       </w:pPr>
-      <w:bookmarkStart w:id="154" w:name="__RefHeading___Toc5671_1460157198"/>
+      <w:bookmarkStart w:id="154" w:name="__RefHeading___Toc31400_3998045290"/>
       <w:bookmarkEnd w:id="154"/>
       <w:r>
         <w:rPr>
@@ -25008,7 +25069,7 @@
       <w:r>
         <w:br w:type="page"/>
       </w:r>
-      <w:bookmarkStart w:id="157" w:name="__RefHeading___Toc5673_1460157198"/>
+      <w:bookmarkStart w:id="157" w:name="__RefHeading___Toc31402_3998045290"/>
       <w:bookmarkEnd w:id="157"/>
       <w:r>
         <w:rPr>
@@ -25035,7 +25096,7 @@
         <w:spacing w:before="200" w:after="80"/>
         <w:rPr/>
       </w:pPr>
-      <w:bookmarkStart w:id="158" w:name="__RefHeading___Toc5675_1460157198"/>
+      <w:bookmarkStart w:id="158" w:name="__RefHeading___Toc31404_3998045290"/>
       <w:bookmarkStart w:id="159" w:name="performance-counters"/>
       <w:bookmarkEnd w:id="158"/>
       <w:r>
@@ -25196,7 +25257,7 @@
         <w:spacing w:before="200" w:after="80"/>
         <w:rPr/>
       </w:pPr>
-      <w:bookmarkStart w:id="160" w:name="__RefHeading___Toc5677_1460157198"/>
+      <w:bookmarkStart w:id="160" w:name="__RefHeading___Toc31406_3998045290"/>
       <w:bookmarkStart w:id="161" w:name="assertions"/>
       <w:bookmarkEnd w:id="160"/>
       <w:r>
@@ -25395,7 +25456,7 @@
         <w:spacing w:before="360" w:after="120"/>
         <w:rPr/>
       </w:pPr>
-      <w:bookmarkStart w:id="164" w:name="__RefHeading___Toc5679_1460157198"/>
+      <w:bookmarkStart w:id="164" w:name="__RefHeading___Toc31408_3998045290"/>
       <w:bookmarkStart w:id="165" w:name="tree-primitives-1"/>
       <w:bookmarkEnd w:id="164"/>
       <w:r>
@@ -25488,7 +25549,7 @@
         <w:spacing w:before="280" w:after="80"/>
         <w:rPr/>
       </w:pPr>
-      <w:bookmarkStart w:id="166" w:name="__RefHeading___Toc5681_1460157198"/>
+      <w:bookmarkStart w:id="166" w:name="__RefHeading___Toc31410_3998045290"/>
       <w:bookmarkStart w:id="167" w:name="delta_split_1to2"/>
       <w:bookmarkEnd w:id="166"/>
       <w:r>
@@ -25635,7 +25696,7 @@
         <w:spacing w:before="280" w:after="80"/>
         <w:rPr/>
       </w:pPr>
-      <w:bookmarkStart w:id="168" w:name="__RefHeading___Toc5683_1460157198"/>
+      <w:bookmarkStart w:id="168" w:name="__RefHeading___Toc31412_3998045290"/>
       <w:bookmarkStart w:id="169" w:name="delta_merge_2to1"/>
       <w:bookmarkEnd w:id="168"/>
       <w:r>
@@ -25703,7 +25764,7 @@
         <w:spacing w:before="280" w:after="80"/>
         <w:rPr/>
       </w:pPr>
-      <w:bookmarkStart w:id="170" w:name="__RefHeading___Toc5685_1460157198"/>
+      <w:bookmarkStart w:id="170" w:name="__RefHeading___Toc31414_3998045290"/>
       <w:bookmarkStart w:id="171" w:name="fan-out-fan-in-trees"/>
       <w:bookmarkEnd w:id="170"/>
       <w:r>
@@ -25770,7 +25831,7 @@
         <w:spacing w:before="280" w:after="80"/>
         <w:rPr/>
       </w:pPr>
-      <w:bookmarkStart w:id="172" w:name="__RefHeading___Toc5687_1460157198"/>
+      <w:bookmarkStart w:id="172" w:name="__RefHeading___Toc31416_3998045290"/>
       <w:bookmarkStart w:id="173" w:name="filelist-convention"/>
       <w:bookmarkEnd w:id="172"/>
       <w:r>
@@ -25940,7 +26001,7 @@
         <w:spacing w:before="360" w:after="120"/>
         <w:rPr/>
       </w:pPr>
-      <w:bookmarkStart w:id="176" w:name="__RefHeading___Toc5689_1460157198"/>
+      <w:bookmarkStart w:id="176" w:name="__RefHeading___Toc31418_3998045290"/>
       <w:bookmarkStart w:id="177" w:name="full-regeneration-rule"/>
       <w:bookmarkEnd w:id="176"/>
       <w:r>
@@ -26290,7 +26351,7 @@
       <w:r>
         <w:br w:type="page"/>
       </w:r>
-      <w:bookmarkStart w:id="179" w:name="__RefHeading___Toc5691_1460157198"/>
+      <w:bookmarkStart w:id="179" w:name="__RefHeading___Toc31420_3998045290"/>
       <w:bookmarkEnd w:id="179"/>
       <w:r>
         <w:rPr>
@@ -26471,7 +26532,7 @@
         <w:spacing w:before="280" w:after="80"/>
         <w:rPr/>
       </w:pPr>
-      <w:bookmarkStart w:id="180" w:name="__RefHeading___Toc5693_1460157198"/>
+      <w:bookmarkStart w:id="180" w:name="__RefHeading___Toc31422_3998045290"/>
       <w:bookmarkStart w:id="181" w:name="do-not-hand-edit-generated-files"/>
       <w:bookmarkEnd w:id="180"/>
       <w:r>
@@ -26630,7 +26691,7 @@
         <w:spacing w:before="360" w:after="120"/>
         <w:rPr/>
       </w:pPr>
-      <w:bookmarkStart w:id="184" w:name="__RefHeading___Toc5695_1460157198"/>
+      <w:bookmarkStart w:id="184" w:name="__RefHeading___Toc31424_3998045290"/>
       <w:bookmarkStart w:id="185" w:name="pre-generated-fixtures"/>
       <w:bookmarkEnd w:id="184"/>
       <w:r>
@@ -26907,7 +26968,7 @@
         <w:spacing w:before="280" w:after="80"/>
         <w:rPr/>
       </w:pPr>
-      <w:bookmarkStart w:id="186" w:name="__RefHeading___Toc5697_1460157198"/>
+      <w:bookmarkStart w:id="186" w:name="__RefHeading___Toc31426_3998045290"/>
       <w:bookmarkStart w:id="187" w:name="custom-variants"/>
       <w:bookmarkEnd w:id="186"/>
       <w:r>
@@ -27040,7 +27101,7 @@
         <w:spacing w:before="360" w:after="120"/>
         <w:rPr/>
       </w:pPr>
-      <w:bookmarkStart w:id="190" w:name="__RefHeading___Toc5699_1460157198"/>
+      <w:bookmarkStart w:id="190" w:name="__RefHeading___Toc31428_3998045290"/>
       <w:bookmarkStart w:id="191" w:name="dv-suite"/>
       <w:bookmarkEnd w:id="190"/>
       <w:r>
@@ -27099,7 +27160,7 @@
         <w:spacing w:before="280" w:after="80"/>
         <w:rPr/>
       </w:pPr>
-      <w:bookmarkStart w:id="192" w:name="__RefHeading___Toc5701_1460157198"/>
+      <w:bookmarkStart w:id="192" w:name="__RefHeading___Toc31430_3998045290"/>
       <w:bookmarkEnd w:id="192"/>
       <w:r>
         <w:rPr>
@@ -27940,7 +28001,7 @@
       <w:r>
         <w:br w:type="page"/>
       </w:r>
-      <w:bookmarkStart w:id="195" w:name="__RefHeading___Toc5703_1460157198"/>
+      <w:bookmarkStart w:id="195" w:name="__RefHeading___Toc31432_3998045290"/>
       <w:bookmarkEnd w:id="195"/>
       <w:r>
         <w:rPr>
@@ -28081,7 +28142,7 @@
         <w:spacing w:before="280" w:after="80"/>
         <w:rPr/>
       </w:pPr>
-      <w:bookmarkStart w:id="196" w:name="__RefHeading___Toc5705_1460157198"/>
+      <w:bookmarkStart w:id="196" w:name="__RefHeading___Toc31434_3998045290"/>
       <w:bookmarkStart w:id="197" w:name="adding-a-new-test"/>
       <w:bookmarkEnd w:id="196"/>
       <w:r>
@@ -28254,7 +28315,7 @@
         <w:spacing w:before="360" w:after="120"/>
         <w:rPr/>
       </w:pPr>
-      <w:bookmarkStart w:id="200" w:name="__RefHeading___Toc5707_1460157198"/>
+      <w:bookmarkStart w:id="200" w:name="__RefHeading___Toc31436_3998045290"/>
       <w:bookmarkStart w:id="201" w:name="lint-checks"/>
       <w:bookmarkEnd w:id="200"/>
       <w:r>
@@ -28300,7 +28361,7 @@
         <w:spacing w:before="280" w:after="80"/>
         <w:rPr/>
       </w:pPr>
-      <w:bookmarkStart w:id="202" w:name="__RefHeading___Toc5709_1460157198"/>
+      <w:bookmarkStart w:id="202" w:name="__RefHeading___Toc31438_3998045290"/>
       <w:bookmarkEnd w:id="202"/>
       <w:r>
         <w:rPr>
@@ -28774,7 +28835,7 @@
       <w:r>
         <w:br w:type="page"/>
       </w:r>
-      <w:bookmarkStart w:id="205" w:name="__RefHeading___Toc5711_1460157198"/>
+      <w:bookmarkStart w:id="205" w:name="__RefHeading___Toc31440_3998045290"/>
       <w:bookmarkEnd w:id="205"/>
       <w:r>
         <w:rPr>
@@ -28904,7 +28965,7 @@
         <w:spacing w:before="360" w:after="120"/>
         <w:rPr/>
       </w:pPr>
-      <w:bookmarkStart w:id="207" w:name="__RefHeading___Toc5713_1460157198"/>
+      <w:bookmarkStart w:id="207" w:name="__RefHeading___Toc31442_3998045290"/>
       <w:bookmarkStart w:id="208" w:name="adding-a-new-topology"/>
       <w:bookmarkEnd w:id="207"/>
       <w:r>
@@ -29231,7 +29292,7 @@
         <w:spacing w:before="280" w:after="80"/>
         <w:rPr/>
       </w:pPr>
-      <w:bookmarkStart w:id="209" w:name="__RefHeading___Toc5715_1460157198"/>
+      <w:bookmarkStart w:id="209" w:name="__RefHeading___Toc31444_3998045290"/>
       <w:bookmarkStart w:id="210" w:name="retired-tree-scaffolding"/>
       <w:bookmarkEnd w:id="209"/>
       <w:r>
@@ -29397,7 +29458,7 @@
         <w:spacing w:before="360" w:after="120"/>
         <w:rPr/>
       </w:pPr>
-      <w:bookmarkStart w:id="213" w:name="__RefHeading___Toc5717_1460157198"/>
+      <w:bookmarkStart w:id="213" w:name="__RefHeading___Toc31446_3998045290"/>
       <w:bookmarkStart w:id="214" w:name="adding-a-new-generator-option"/>
       <w:bookmarkEnd w:id="213"/>
       <w:r>
@@ -29601,7 +29662,7 @@
         <w:spacing w:before="280" w:after="80"/>
         <w:rPr/>
       </w:pPr>
-      <w:bookmarkStart w:id="215" w:name="__RefHeading___Toc5719_1460157198"/>
+      <w:bookmarkStart w:id="215" w:name="__RefHeading___Toc31448_3998045290"/>
       <w:bookmarkStart w:id="216" w:name="backward-compatibility"/>
       <w:bookmarkEnd w:id="215"/>
       <w:r>
@@ -29649,7 +29710,7 @@
         <w:spacing w:before="280" w:after="80"/>
         <w:rPr/>
       </w:pPr>
-      <w:bookmarkStart w:id="218" w:name="__RefHeading___Toc5721_1460157198"/>
+      <w:bookmarkStart w:id="218" w:name="__RefHeading___Toc31450_3998045290"/>
       <w:bookmarkStart w:id="219" w:name="example-adding-a-qos-sideband"/>
       <w:bookmarkEnd w:id="218"/>
       <w:r>
@@ -29899,7 +29960,7 @@
         <w:spacing w:before="360" w:after="120"/>
         <w:rPr/>
       </w:pPr>
-      <w:bookmarkStart w:id="222" w:name="__RefHeading___Toc5723_1460157198"/>
+      <w:bookmarkStart w:id="222" w:name="__RefHeading___Toc31452_3998045290"/>
       <w:bookmarkStart w:id="223" w:name="adding-amba-5-sidebands"/>
       <w:bookmarkEnd w:id="222"/>
       <w:r>
@@ -30239,7 +30300,7 @@
         <w:spacing w:before="280" w:after="80"/>
         <w:rPr/>
       </w:pPr>
-      <w:bookmarkStart w:id="224" w:name="__RefHeading___Toc5725_1460157198"/>
+      <w:bookmarkStart w:id="224" w:name="__RefHeading___Toc31454_3998045290"/>
       <w:bookmarkStart w:id="225" w:name="twakeup-design-note"/>
       <w:bookmarkEnd w:id="224"/>
       <w:r>
@@ -30332,7 +30393,7 @@
         <w:spacing w:before="280" w:after="80"/>
         <w:rPr/>
       </w:pPr>
-      <w:bookmarkStart w:id="226" w:name="__RefHeading___Toc5727_1460157198"/>
+      <w:bookmarkStart w:id="226" w:name="__RefHeading___Toc31456_3998045290"/>
       <w:bookmarkStart w:id="227" w:name="check-signal-design-note"/>
       <w:bookmarkEnd w:id="226"/>
       <w:r>
@@ -30556,7 +30617,7 @@
         <w:spacing w:before="360" w:after="120"/>
         <w:rPr/>
       </w:pPr>
-      <w:bookmarkStart w:id="230" w:name="__RefHeading___Toc5729_1460157198"/>
+      <w:bookmarkStart w:id="230" w:name="__RefHeading___Toc31458_3998045290"/>
       <w:bookmarkStart w:id="231" w:name="testing-an-extension"/>
       <w:bookmarkEnd w:id="230"/>
       <w:r>
@@ -30602,7 +30663,7 @@
         <w:spacing w:before="280" w:after="80"/>
         <w:rPr/>
       </w:pPr>
-      <w:bookmarkStart w:id="232" w:name="__RefHeading___Toc5731_1460157198"/>
+      <w:bookmarkStart w:id="232" w:name="__RefHeading___Toc31460_3998045290"/>
       <w:bookmarkStart w:id="233" w:name="minimal-test-plan"/>
       <w:bookmarkEnd w:id="232"/>
       <w:r>
@@ -30731,7 +30792,7 @@
         <w:spacing w:before="280" w:after="80"/>
         <w:rPr/>
       </w:pPr>
-      <w:bookmarkStart w:id="234" w:name="__RefHeading___Toc5733_1460157198"/>
+      <w:bookmarkStart w:id="234" w:name="__RefHeading___Toc31462_3998045290"/>
       <w:bookmarkStart w:id="235" w:name="example-adding-a-custom-variant-test"/>
       <w:bookmarkEnd w:id="234"/>
       <w:r>
@@ -30920,7 +30981,7 @@
         <w:spacing w:before="280" w:after="80"/>
         <w:rPr/>
       </w:pPr>
-      <w:bookmarkStart w:id="236" w:name="__RefHeading___Toc5735_1460157198"/>
+      <w:bookmarkStart w:id="236" w:name="__RefHeading___Toc31464_3998045290"/>
       <w:bookmarkStart w:id="237" w:name="commit-discipline"/>
       <w:bookmarkEnd w:id="236"/>
       <w:r>

</xml_diff>